<commit_message>
Finished planning and tracking
</commit_message>
<xml_diff>
--- a/se_1b.docx
+++ b/se_1b.docx
@@ -25,10 +25,11 @@
       <w:r>
         <w:t xml:space="preserve"> New Zealand by 11 companies all belonging to a sole investment management franchise. The large body of code making up the software has deteriorated and does not support mobile platforms with only 3 people to maintain and support it.</w:t>
       </w:r>
-    </w:p>
-    <w:p>
-      <w:r>
-        <w:t>The software is due for redevelopment by an in-house development team of 15 but the franchise group are looking to expand this to 18 by the end of 2017.</w:t>
+      <w:r>
+        <w:t xml:space="preserve"> T</w:t>
+      </w:r>
+      <w:r>
+        <w:t>he software is due for redevelopment by an in-house development team of 15 but the franchise group are looking to expand this to 18 by the end of 2017.</w:t>
       </w:r>
     </w:p>
     <w:p>
@@ -208,13 +209,7 @@
         <w:t>scrum</w:t>
       </w:r>
       <w:r>
-        <w:t xml:space="preserve"> does show some benefits over </w:t>
-      </w:r>
-      <w:r>
-        <w:t>more traditional methodologies</w:t>
-      </w:r>
-      <w:r>
-        <w:t xml:space="preserve"> </w:t>
+        <w:t xml:space="preserve"> does show some benefits over more traditional methodologies </w:t>
       </w:r>
       <w:r>
         <w:t xml:space="preserve">as in her study </w:t>
@@ -307,24 +302,47 @@
         <w:t xml:space="preserve"> there is some correlation between the amount of time spent planning and the success of a project </w:t>
       </w:r>
       <w:r>
-        <w:t xml:space="preserve">[2] </w:t>
-      </w:r>
-      <w:bookmarkStart w:id="0" w:name="_GoBack"/>
-      <w:bookmarkEnd w:id="0"/>
+        <w:t>[2]</w:t>
+      </w:r>
+      <w:r>
+        <w:t xml:space="preserve">, even if the research </w:t>
+      </w:r>
+      <w:r>
+        <w:t xml:space="preserve">looked at agile methodologies under a single umbrella, they </w:t>
+      </w:r>
+      <w:r>
+        <w:t>more or less follow the same basic principles of agile and</w:t>
+      </w:r>
+      <w:r>
+        <w:t xml:space="preserve"> </w:t>
+      </w:r>
       <w:r>
         <w:t>thus</w:t>
       </w:r>
       <w:r>
-        <w:t xml:space="preserve"> the benefits of a product backlog along with the necessary planning </w:t>
-      </w:r>
-      <w:r>
-        <w:t xml:space="preserve">that goes along with it </w:t>
-      </w:r>
-      <w:r>
-        <w:t xml:space="preserve">cannot be discounted. </w:t>
-      </w:r>
-    </w:p>
-    <w:p/>
+        <w:t xml:space="preserve"> the </w:t>
+      </w:r>
+      <w:r>
+        <w:t>results</w:t>
+      </w:r>
+      <w:r>
+        <w:t xml:space="preserve"> </w:t>
+      </w:r>
+      <w:r>
+        <w:t>can be applied to scrum practices as well</w:t>
+      </w:r>
+      <w:r>
+        <w:t xml:space="preserve">. </w:t>
+      </w:r>
+    </w:p>
+    <w:p>
+      <w:r>
+        <w:t xml:space="preserve">It is plain to see the practices of agile will benefit this project regardless of what they were, but the practice of creating a product backlog was chosen because the documentation provides an overview of the project requirements and scope to team members along with the ability to track progress as a by-product of the accompanying gaant chart common this practice. Due to the immense size of the software this practice will allow the project team to prioritize and </w:t>
+      </w:r>
+      <w:r>
+        <w:t>manage requirement complexity as well as to keep the project complexity low to allow future team members to understand what is required from the project quickly as possible.</w:t>
+      </w:r>
+    </w:p>
     <w:p>
       <w:pPr>
         <w:pStyle w:val="Heading2"/>
@@ -570,6 +588,60 @@
           <w:shd w:val="clear" w:color="auto" w:fill="FFE7AF"/>
         </w:rPr>
         <w:t>(5), 1040-1051. doi:10.1016/j.ijproman.2015.01.006</w:t>
+      </w:r>
+      <w:bookmarkStart w:id="0" w:name="_GoBack"/>
+      <w:bookmarkEnd w:id="0"/>
+    </w:p>
+    <w:p>
+      <w:pPr>
+        <w:pStyle w:val="ListParagraph"/>
+        <w:numPr>
+          <w:ilvl w:val="0"/>
+          <w:numId w:val="1"/>
+        </w:numPr>
+      </w:pPr>
+      <w:r>
+        <w:rPr>
+          <w:rFonts w:ascii="Arial" w:hAnsi="Arial" w:cs="Arial"/>
+          <w:b/>
+          <w:bCs/>
+          <w:color w:val="333333"/>
+          <w:shd w:val="clear" w:color="auto" w:fill="FFE7AF"/>
+        </w:rPr>
+        <w:t>Talbot, A., &amp; Connor, A. (2011). Requirements Engineering Current Practice and Capability in Small and Medium Software Development Enterprises in New Zealand.</w:t>
+      </w:r>
+      <w:r>
+        <w:rPr>
+          <w:rStyle w:val="apple-converted-space"/>
+          <w:rFonts w:ascii="Arial" w:hAnsi="Arial" w:cs="Arial"/>
+          <w:b/>
+          <w:bCs/>
+          <w:color w:val="333333"/>
+          <w:shd w:val="clear" w:color="auto" w:fill="FFE7AF"/>
+        </w:rPr>
+        <w:t> </w:t>
+      </w:r>
+      <w:r>
+        <w:rPr>
+          <w:rFonts w:ascii="Arial" w:hAnsi="Arial" w:cs="Arial"/>
+          <w:b/>
+          <w:bCs/>
+          <w:i/>
+          <w:iCs/>
+          <w:color w:val="333333"/>
+          <w:shd w:val="clear" w:color="auto" w:fill="FFE7AF"/>
+        </w:rPr>
+        <w:t>2011 Ninth International Conference on Software Engineering Research, Management and Applications</w:t>
+      </w:r>
+      <w:r>
+        <w:rPr>
+          <w:rFonts w:ascii="Arial" w:hAnsi="Arial" w:cs="Arial"/>
+          <w:b/>
+          <w:bCs/>
+          <w:color w:val="333333"/>
+          <w:shd w:val="clear" w:color="auto" w:fill="FFE7AF"/>
+        </w:rPr>
+        <w:t>. doi:10.1109/sera.2011.39</w:t>
       </w:r>
     </w:p>
     <w:sectPr>

</xml_diff>

<commit_message>
Conclusion to be completed
</commit_message>
<xml_diff>
--- a/se_1b.docx
+++ b/se_1b.docx
@@ -163,8 +163,158 @@
         <w:t>Requirements Engineering</w:t>
       </w:r>
     </w:p>
+    <w:p>
+      <w:r>
+        <w:t>User stories is a practice taking an unprocessed requirement then refining this into a description of a functionality from the perspective of a user in a system</w:t>
+      </w:r>
+      <w:r>
+        <w:t xml:space="preserve"> </w:t>
+      </w:r>
+      <w:r>
+        <w:t>although</w:t>
+      </w:r>
+      <w:r>
+        <w:t xml:space="preserve"> not exclusive</w:t>
+      </w:r>
+      <w:r>
+        <w:t>ly</w:t>
+      </w:r>
+      <w:r>
+        <w:t xml:space="preserve"> </w:t>
+      </w:r>
+      <w:r>
+        <w:t>a</w:t>
+      </w:r>
+      <w:r>
+        <w:t xml:space="preserve"> scrum</w:t>
+      </w:r>
+      <w:r>
+        <w:t xml:space="preserve"> practice</w:t>
+      </w:r>
+      <w:r>
+        <w:t>.</w:t>
+      </w:r>
+      <w:r>
+        <w:t xml:space="preserve"> Allow the development team to define the scope of the project a</w:t>
+      </w:r>
+      <w:r>
+        <w:t xml:space="preserve">nd are a way of </w:t>
+      </w:r>
+      <w:r>
+        <w:t xml:space="preserve">ensuring that the </w:t>
+      </w:r>
+      <w:r>
+        <w:t>client and</w:t>
+      </w:r>
+      <w:r>
+        <w:t xml:space="preserve"> development team is on the same page</w:t>
+      </w:r>
+      <w:r>
+        <w:t>. All of these</w:t>
+      </w:r>
+      <w:r>
+        <w:t xml:space="preserve"> should address the 3 top issues identified by Talbot &amp; Connor</w:t>
+      </w:r>
+      <w:r>
+        <w:t>, “Scope creep, Client acceptance of resources spent on requirements and Quality of specification”</w:t>
+      </w:r>
+      <w:r>
+        <w:t xml:space="preserve"> [3].</w:t>
+      </w:r>
+    </w:p>
+    <w:p>
+      <w:proofErr w:type="spellStart"/>
+      <w:r>
+        <w:t>Iqra</w:t>
+      </w:r>
+      <w:proofErr w:type="spellEnd"/>
+      <w:r>
+        <w:t xml:space="preserve"> c</w:t>
+      </w:r>
+      <w:r>
+        <w:t>oncluded that</w:t>
+      </w:r>
+      <w:r>
+        <w:t xml:space="preserve"> most organizations ignore subtle activities within requirements engineering often </w:t>
+      </w:r>
+      <w:r>
+        <w:t>lead</w:t>
+      </w:r>
+      <w:r>
+        <w:t>ing</w:t>
+      </w:r>
+      <w:r>
+        <w:t xml:space="preserve"> to vague requirements that do not </w:t>
+      </w:r>
+      <w:r>
+        <w:t>fulfil</w:t>
+      </w:r>
+      <w:r>
+        <w:t xml:space="preserve"> the stakeholders needs</w:t>
+      </w:r>
+      <w:r>
+        <w:t xml:space="preserve"> [4]. T</w:t>
+      </w:r>
+      <w:r>
+        <w:t xml:space="preserve">his leads us to think that </w:t>
+      </w:r>
+      <w:r>
+        <w:t>formality in</w:t>
+      </w:r>
+      <w:r>
+        <w:t xml:space="preserve"> </w:t>
+      </w:r>
+      <w:r>
+        <w:t xml:space="preserve">the </w:t>
+      </w:r>
+      <w:r>
+        <w:t xml:space="preserve">requirements engineering process </w:t>
+      </w:r>
+      <w:r>
+        <w:t xml:space="preserve">in terms of how well documents and followed the process is, </w:t>
+      </w:r>
+      <w:r>
+        <w:t>has a major impact on the quality of requirements generated and how well the project succeeds further down the line.</w:t>
+      </w:r>
+    </w:p>
     <w:p/>
     <w:p>
+      <w:r>
+        <w:lastRenderedPageBreak/>
+        <w:t xml:space="preserve">Though Talbot &amp; Connor’s results were not conclusive it is an indication of the areas that are affected by requirements engineering </w:t>
+      </w:r>
+      <w:r>
+        <w:t>and how user stories may benefit this case study</w:t>
+      </w:r>
+      <w:r>
+        <w:t>.</w:t>
+      </w:r>
+      <w:r>
+        <w:t xml:space="preserve"> User stories would allow the development team to easily document requirements </w:t>
+      </w:r>
+      <w:r>
+        <w:t xml:space="preserve">and feeds directly into the scrum practice of product </w:t>
+      </w:r>
+      <w:r>
+        <w:t>backlogs. This</w:t>
+      </w:r>
+      <w:r>
+        <w:t xml:space="preserve"> research </w:t>
+      </w:r>
+      <w:r>
+        <w:t xml:space="preserve">tells us </w:t>
+      </w:r>
+      <w:r>
+        <w:t>user stories are small piece but a step in the right direction for building a formal requirement engineering process</w:t>
+      </w:r>
+      <w:r>
+        <w:t xml:space="preserve"> for the development team</w:t>
+      </w:r>
+      <w:r>
+        <w:t xml:space="preserve">. </w:t>
+      </w:r>
+    </w:p>
+    <w:p>
       <w:pPr>
         <w:pStyle w:val="Heading2"/>
       </w:pPr>
@@ -264,112 +414,143 @@
         <w:t xml:space="preserve"> other things</w:t>
       </w:r>
       <w:r>
-        <w:t xml:space="preserve"> and may be lost if less time were to be spent on this, with more research needing to be done in this area </w:t>
-      </w:r>
+        <w:t xml:space="preserve"> and may be lost if less time were to be spent on this, with more research needing to be done in this area [1]. I do agree with her on both points as scrum is a methodology with a strong focus on</w:t>
+      </w:r>
+      <w:r>
+        <w:t xml:space="preserve"> planning and re-planning especially at the beginning of sprints. </w:t>
+      </w:r>
+    </w:p>
+    <w:p>
+      <w:r>
+        <w:t>Of course there were many limitation in this study in that they only looked at one set of project groups within a corporation</w:t>
+      </w:r>
+      <w:r>
+        <w:t xml:space="preserve"> or participant error amongst other things</w:t>
+      </w:r>
+      <w:r>
+        <w:t xml:space="preserve"> however there is other research that shows the benefits of agile practices</w:t>
+      </w:r>
+      <w:r>
+        <w:t xml:space="preserve">. </w:t>
+      </w:r>
+      <w:proofErr w:type="spellStart"/>
+      <w:r>
+        <w:t>Serrador</w:t>
+      </w:r>
+      <w:proofErr w:type="spellEnd"/>
+      <w:r>
+        <w:t xml:space="preserve"> &amp; Pinto </w:t>
+      </w:r>
+      <w:r>
+        <w:t>found in their research that</w:t>
+      </w:r>
+      <w:r>
+        <w:t xml:space="preserve"> there is some correlation between the amount of time spent planning and the success of a project </w:t>
+      </w:r>
+      <w:r>
+        <w:t>[2]</w:t>
+      </w:r>
+      <w:r>
+        <w:t xml:space="preserve">, even if the research </w:t>
+      </w:r>
+      <w:r>
+        <w:t xml:space="preserve">looked at agile methodologies under a single umbrella, they </w:t>
+      </w:r>
+      <w:r>
+        <w:t>more or less follow the same basic principles of agile and</w:t>
+      </w:r>
+      <w:r>
+        <w:t xml:space="preserve"> </w:t>
+      </w:r>
+      <w:r>
+        <w:t>thus</w:t>
+      </w:r>
+      <w:r>
+        <w:t xml:space="preserve"> the </w:t>
+      </w:r>
+      <w:r>
+        <w:t>results</w:t>
+      </w:r>
+      <w:r>
+        <w:t xml:space="preserve"> </w:t>
+      </w:r>
+      <w:r>
+        <w:t>can be applied to scrum practices as well</w:t>
+      </w:r>
+      <w:r>
+        <w:t xml:space="preserve">. </w:t>
+      </w:r>
+    </w:p>
+    <w:p>
+      <w:r>
+        <w:t xml:space="preserve">It is plain to see the practices of agile will benefit this project regardless of what they were, but the practice of creating a product backlog was chosen because the documentation provides an overview of the project requirements and scope to team members along with the ability to track progress as a by-product of the accompanying gaant chart common this practice. Due to the immense size of the software this practice will allow the </w:t>
+      </w:r>
+      <w:r>
+        <w:t>development</w:t>
+      </w:r>
+      <w:r>
+        <w:t xml:space="preserve"> team to prioritize and </w:t>
+      </w:r>
+      <w:r>
+        <w:t>manage requirement complexity as well as to keep the project complexity low to allow future team members to understand what is required from the project quickly as possible.</w:t>
+      </w:r>
+    </w:p>
+    <w:p>
+      <w:pPr>
+        <w:pStyle w:val="Heading2"/>
+      </w:pPr>
+      <w:r>
+        <w:t>Managing Change</w:t>
+      </w:r>
+    </w:p>
+    <w:p/>
+    <w:p>
+      <w:pPr>
+        <w:pStyle w:val="Heading2"/>
+      </w:pPr>
+      <w:r>
+        <w:t>Quality Assurance</w:t>
+      </w:r>
+    </w:p>
+    <w:p>
+      <w:pPr>
+        <w:pStyle w:val="Heading1"/>
+      </w:pPr>
+      <w:r>
+        <w:t>Conclusion</w:t>
+      </w:r>
+    </w:p>
+    <w:p>
+      <w:r>
+        <w:t>To conclude overall a scrum approach would benefit this development team if they are not already utilizing this methodology</w:t>
+      </w:r>
+      <w:r>
+        <w:t>.</w:t>
+      </w:r>
+      <w:r>
+        <w:t xml:space="preserve"> </w:t>
+      </w:r>
+      <w:r>
+        <w:t>T</w:t>
+      </w:r>
+      <w:r>
+        <w:t>here is plenty of research providing empirical evidence of the benefits of agile over traditional methodologies.</w:t>
+      </w:r>
+      <w:r>
+        <w:t xml:space="preserve"> </w:t>
+      </w:r>
+      <w:bookmarkStart w:id="0" w:name="_GoBack"/>
+      <w:bookmarkEnd w:id="0"/>
+      <w:r>
+        <w:t>However this does not mean the development team should reject and should not adapt what already works for them into an agile methodology.</w:t>
+      </w:r>
+    </w:p>
+    <w:p>
+      <w:pPr>
+        <w:pStyle w:val="Heading1"/>
+      </w:pPr>
       <w:r>
         <w:lastRenderedPageBreak/>
-        <w:t>[1]. I do agree with her on both points as scrum is a methodology with a strong focus on</w:t>
-      </w:r>
-      <w:r>
-        <w:t xml:space="preserve"> planning and re-planning especially at the beginning of sprints. </w:t>
-      </w:r>
-    </w:p>
-    <w:p>
-      <w:r>
-        <w:t>Of course there were many limitation in this study in that they only looked at one set of project groups within a corporation</w:t>
-      </w:r>
-      <w:r>
-        <w:t xml:space="preserve"> or participant error amongst other things</w:t>
-      </w:r>
-      <w:r>
-        <w:t xml:space="preserve"> however there is other research that shows the benefits of agile practices</w:t>
-      </w:r>
-      <w:r>
-        <w:t xml:space="preserve">. </w:t>
-      </w:r>
-      <w:proofErr w:type="spellStart"/>
-      <w:r>
-        <w:t>Serrador</w:t>
-      </w:r>
-      <w:proofErr w:type="spellEnd"/>
-      <w:r>
-        <w:t xml:space="preserve"> &amp; Pinto </w:t>
-      </w:r>
-      <w:r>
-        <w:t>found in their research that</w:t>
-      </w:r>
-      <w:r>
-        <w:t xml:space="preserve"> there is some correlation between the amount of time spent planning and the success of a project </w:t>
-      </w:r>
-      <w:r>
-        <w:t>[2]</w:t>
-      </w:r>
-      <w:r>
-        <w:t xml:space="preserve">, even if the research </w:t>
-      </w:r>
-      <w:r>
-        <w:t xml:space="preserve">looked at agile methodologies under a single umbrella, they </w:t>
-      </w:r>
-      <w:r>
-        <w:t>more or less follow the same basic principles of agile and</w:t>
-      </w:r>
-      <w:r>
-        <w:t xml:space="preserve"> </w:t>
-      </w:r>
-      <w:r>
-        <w:t>thus</w:t>
-      </w:r>
-      <w:r>
-        <w:t xml:space="preserve"> the </w:t>
-      </w:r>
-      <w:r>
-        <w:t>results</w:t>
-      </w:r>
-      <w:r>
-        <w:t xml:space="preserve"> </w:t>
-      </w:r>
-      <w:r>
-        <w:t>can be applied to scrum practices as well</w:t>
-      </w:r>
-      <w:r>
-        <w:t xml:space="preserve">. </w:t>
-      </w:r>
-    </w:p>
-    <w:p>
-      <w:r>
-        <w:t xml:space="preserve">It is plain to see the practices of agile will benefit this project regardless of what they were, but the practice of creating a product backlog was chosen because the documentation provides an overview of the project requirements and scope to team members along with the ability to track progress as a by-product of the accompanying gaant chart common this practice. Due to the immense size of the software this practice will allow the project team to prioritize and </w:t>
-      </w:r>
-      <w:r>
-        <w:t>manage requirement complexity as well as to keep the project complexity low to allow future team members to understand what is required from the project quickly as possible.</w:t>
-      </w:r>
-    </w:p>
-    <w:p>
-      <w:pPr>
-        <w:pStyle w:val="Heading2"/>
-      </w:pPr>
-      <w:r>
-        <w:t>Managing Change</w:t>
-      </w:r>
-    </w:p>
-    <w:p/>
-    <w:p>
-      <w:pPr>
-        <w:pStyle w:val="Heading2"/>
-      </w:pPr>
-      <w:r>
-        <w:t>Quality Assurance</w:t>
-      </w:r>
-    </w:p>
-    <w:p>
-      <w:pPr>
-        <w:pStyle w:val="Heading1"/>
-      </w:pPr>
-    </w:p>
-    <w:p>
-      <w:pPr>
-        <w:pStyle w:val="Heading1"/>
-      </w:pPr>
-      <w:r>
         <w:t>References</w:t>
       </w:r>
     </w:p>
@@ -380,6 +561,8 @@
           <w:ilvl w:val="0"/>
           <w:numId w:val="1"/>
         </w:numPr>
+        <w:spacing w:before="240" w:line="240" w:lineRule="auto"/>
+        <w:ind w:left="714" w:hanging="357"/>
       </w:pPr>
       <w:proofErr w:type="spellStart"/>
       <w:r>
@@ -502,6 +685,13 @@
         </w:rPr>
         <w:t>. doi:10.1109/esem.2013.53</w:t>
       </w:r>
+    </w:p>
+    <w:p>
+      <w:pPr>
+        <w:pStyle w:val="ListParagraph"/>
+        <w:spacing w:before="240" w:line="240" w:lineRule="auto"/>
+        <w:ind w:left="714"/>
+      </w:pPr>
     </w:p>
     <w:p>
       <w:pPr>
@@ -510,6 +700,8 @@
           <w:ilvl w:val="0"/>
           <w:numId w:val="1"/>
         </w:numPr>
+        <w:spacing w:before="240" w:after="0" w:line="240" w:lineRule="auto"/>
+        <w:ind w:left="714" w:hanging="357"/>
       </w:pPr>
       <w:proofErr w:type="spellStart"/>
       <w:r>
@@ -589,8 +781,19 @@
         </w:rPr>
         <w:t>(5), 1040-1051. doi:10.1016/j.ijproman.2015.01.006</w:t>
       </w:r>
-      <w:bookmarkStart w:id="0" w:name="_GoBack"/>
-      <w:bookmarkEnd w:id="0"/>
+    </w:p>
+    <w:p>
+      <w:pPr>
+        <w:pStyle w:val="ListParagraph"/>
+        <w:spacing w:line="240" w:lineRule="auto"/>
+      </w:pPr>
+    </w:p>
+    <w:p>
+      <w:pPr>
+        <w:pStyle w:val="ListParagraph"/>
+        <w:spacing w:before="240" w:after="0" w:line="240" w:lineRule="auto"/>
+        <w:ind w:left="714"/>
+      </w:pPr>
     </w:p>
     <w:p>
       <w:pPr>
@@ -599,6 +802,8 @@
           <w:ilvl w:val="0"/>
           <w:numId w:val="1"/>
         </w:numPr>
+        <w:spacing w:before="240" w:line="240" w:lineRule="auto"/>
+        <w:ind w:left="714" w:hanging="357"/>
       </w:pPr>
       <w:r>
         <w:rPr>
@@ -642,6 +847,200 @@
           <w:shd w:val="clear" w:color="auto" w:fill="FFE7AF"/>
         </w:rPr>
         <w:t>. doi:10.1109/sera.2011.39</w:t>
+      </w:r>
+    </w:p>
+    <w:p>
+      <w:pPr>
+        <w:pStyle w:val="ListParagraph"/>
+        <w:spacing w:before="240" w:line="240" w:lineRule="auto"/>
+        <w:ind w:left="714"/>
+      </w:pPr>
+    </w:p>
+    <w:p>
+      <w:pPr>
+        <w:pStyle w:val="ListParagraph"/>
+        <w:numPr>
+          <w:ilvl w:val="0"/>
+          <w:numId w:val="1"/>
+        </w:numPr>
+        <w:spacing w:before="240" w:after="0" w:line="240" w:lineRule="auto"/>
+        <w:ind w:left="714" w:hanging="357"/>
+      </w:pPr>
+      <w:proofErr w:type="spellStart"/>
+      <w:r>
+        <w:rPr>
+          <w:rFonts w:ascii="Arial" w:hAnsi="Arial" w:cs="Arial"/>
+          <w:b/>
+          <w:bCs/>
+          <w:color w:val="333333"/>
+          <w:shd w:val="clear" w:color="auto" w:fill="FFE7AF"/>
+        </w:rPr>
+        <w:t>Iqra</w:t>
+      </w:r>
+      <w:proofErr w:type="spellEnd"/>
+      <w:r>
+        <w:rPr>
+          <w:rFonts w:ascii="Arial" w:hAnsi="Arial" w:cs="Arial"/>
+          <w:b/>
+          <w:bCs/>
+          <w:color w:val="333333"/>
+          <w:shd w:val="clear" w:color="auto" w:fill="FFE7AF"/>
+        </w:rPr>
+        <w:t xml:space="preserve">, B., </w:t>
+      </w:r>
+      <w:proofErr w:type="spellStart"/>
+      <w:r>
+        <w:rPr>
+          <w:rFonts w:ascii="Arial" w:hAnsi="Arial" w:cs="Arial"/>
+          <w:b/>
+          <w:bCs/>
+          <w:color w:val="333333"/>
+          <w:shd w:val="clear" w:color="auto" w:fill="FFE7AF"/>
+        </w:rPr>
+        <w:t>Memuna</w:t>
+      </w:r>
+      <w:proofErr w:type="spellEnd"/>
+      <w:r>
+        <w:rPr>
+          <w:rFonts w:ascii="Arial" w:hAnsi="Arial" w:cs="Arial"/>
+          <w:b/>
+          <w:bCs/>
+          <w:color w:val="333333"/>
+          <w:shd w:val="clear" w:color="auto" w:fill="FFE7AF"/>
+        </w:rPr>
+        <w:t xml:space="preserve">, F., </w:t>
+      </w:r>
+      <w:proofErr w:type="spellStart"/>
+      <w:r>
+        <w:rPr>
+          <w:rFonts w:ascii="Arial" w:hAnsi="Arial" w:cs="Arial"/>
+          <w:b/>
+          <w:bCs/>
+          <w:color w:val="333333"/>
+          <w:shd w:val="clear" w:color="auto" w:fill="FFE7AF"/>
+        </w:rPr>
+        <w:t>Rozina</w:t>
+      </w:r>
+      <w:proofErr w:type="spellEnd"/>
+      <w:r>
+        <w:rPr>
+          <w:rFonts w:ascii="Arial" w:hAnsi="Arial" w:cs="Arial"/>
+          <w:b/>
+          <w:bCs/>
+          <w:color w:val="333333"/>
+          <w:shd w:val="clear" w:color="auto" w:fill="FFE7AF"/>
+        </w:rPr>
+        <w:t xml:space="preserve">, N., </w:t>
+      </w:r>
+      <w:proofErr w:type="spellStart"/>
+      <w:r>
+        <w:rPr>
+          <w:rFonts w:ascii="Arial" w:hAnsi="Arial" w:cs="Arial"/>
+          <w:b/>
+          <w:bCs/>
+          <w:color w:val="333333"/>
+          <w:shd w:val="clear" w:color="auto" w:fill="FFE7AF"/>
+        </w:rPr>
+        <w:t>Rabia</w:t>
+      </w:r>
+      <w:proofErr w:type="spellEnd"/>
+      <w:r>
+        <w:rPr>
+          <w:rFonts w:ascii="Arial" w:hAnsi="Arial" w:cs="Arial"/>
+          <w:b/>
+          <w:bCs/>
+          <w:color w:val="333333"/>
+          <w:shd w:val="clear" w:color="auto" w:fill="FFE7AF"/>
+        </w:rPr>
+        <w:t xml:space="preserve">, H., &amp; </w:t>
+      </w:r>
+      <w:proofErr w:type="spellStart"/>
+      <w:r>
+        <w:rPr>
+          <w:rFonts w:ascii="Arial" w:hAnsi="Arial" w:cs="Arial"/>
+          <w:b/>
+          <w:bCs/>
+          <w:color w:val="333333"/>
+          <w:shd w:val="clear" w:color="auto" w:fill="FFE7AF"/>
+        </w:rPr>
+        <w:t>Assia</w:t>
+      </w:r>
+      <w:proofErr w:type="spellEnd"/>
+      <w:r>
+        <w:rPr>
+          <w:rFonts w:ascii="Arial" w:hAnsi="Arial" w:cs="Arial"/>
+          <w:b/>
+          <w:bCs/>
+          <w:color w:val="333333"/>
+          <w:shd w:val="clear" w:color="auto" w:fill="FFE7AF"/>
+        </w:rPr>
+        <w:t xml:space="preserve">, K., </w:t>
+      </w:r>
+      <w:proofErr w:type="spellStart"/>
+      <w:r>
+        <w:rPr>
+          <w:rFonts w:ascii="Arial" w:hAnsi="Arial" w:cs="Arial"/>
+          <w:b/>
+          <w:bCs/>
+          <w:color w:val="333333"/>
+          <w:shd w:val="clear" w:color="auto" w:fill="FFE7AF"/>
+        </w:rPr>
+        <w:t>Dr.</w:t>
+      </w:r>
+      <w:proofErr w:type="spellEnd"/>
+      <w:r>
+        <w:rPr>
+          <w:rFonts w:ascii="Arial" w:hAnsi="Arial" w:cs="Arial"/>
+          <w:b/>
+          <w:bCs/>
+          <w:color w:val="333333"/>
+          <w:shd w:val="clear" w:color="auto" w:fill="FFE7AF"/>
+        </w:rPr>
+        <w:t xml:space="preserve"> (2013). Requirements engineering practices in small and medium software companies: An empirical study.</w:t>
+      </w:r>
+      <w:r>
+        <w:rPr>
+          <w:rStyle w:val="apple-converted-space"/>
+          <w:rFonts w:ascii="Arial" w:hAnsi="Arial" w:cs="Arial"/>
+          <w:b/>
+          <w:bCs/>
+          <w:color w:val="333333"/>
+          <w:shd w:val="clear" w:color="auto" w:fill="FFE7AF"/>
+        </w:rPr>
+        <w:t> </w:t>
+      </w:r>
+      <w:r>
+        <w:rPr>
+          <w:rFonts w:ascii="Arial" w:hAnsi="Arial" w:cs="Arial"/>
+          <w:b/>
+          <w:bCs/>
+          <w:i/>
+          <w:iCs/>
+          <w:color w:val="333333"/>
+          <w:shd w:val="clear" w:color="auto" w:fill="FFE7AF"/>
+        </w:rPr>
+        <w:t>In Science and Information Conference 2013,</w:t>
+      </w:r>
+      <w:r>
+        <w:rPr>
+          <w:rStyle w:val="apple-converted-space"/>
+          <w:rFonts w:ascii="Arial" w:hAnsi="Arial" w:cs="Arial"/>
+          <w:b/>
+          <w:bCs/>
+          <w:color w:val="333333"/>
+          <w:shd w:val="clear" w:color="auto" w:fill="FFE7AF"/>
+        </w:rPr>
+        <w:t> </w:t>
+      </w:r>
+      <w:r>
+        <w:rPr>
+          <w:rFonts w:ascii="Arial" w:hAnsi="Arial" w:cs="Arial"/>
+          <w:b/>
+          <w:bCs/>
+          <w:color w:val="333333"/>
+          <w:shd w:val="clear" w:color="auto" w:fill="FFE7AF"/>
+        </w:rPr>
+        <w:t>7-9.</w:t>
       </w:r>
     </w:p>
     <w:sectPr>

</xml_diff>

<commit_message>
Added to conclusion and requirements engineering
</commit_message>
<xml_diff>
--- a/se_1b.docx
+++ b/se_1b.docx
@@ -281,267 +281,281 @@
     <w:p>
       <w:r>
         <w:lastRenderedPageBreak/>
-        <w:t xml:space="preserve">Though Talbot &amp; Connor’s results were not conclusive it is an indication of the areas that are affected by requirements engineering </w:t>
-      </w:r>
-      <w:r>
-        <w:t>and how user stories may benefit this case study</w:t>
+        <w:t xml:space="preserve">Though Talbot &amp; Connor’s results were not conclusive it is an indication of the areas that are affected by requirements engineering and how user stories may benefit this case study. User stories would allow the development team to easily document requirements </w:t>
+      </w:r>
+      <w:r>
+        <w:t xml:space="preserve">and feeds directly into the scrum practice of product </w:t>
+      </w:r>
+      <w:r>
+        <w:t xml:space="preserve">backlogs. </w:t>
+      </w:r>
+    </w:p>
+    <w:p>
+      <w:r>
+        <w:t>These two papers</w:t>
+      </w:r>
+      <w:r>
+        <w:t xml:space="preserve"> </w:t>
+      </w:r>
+      <w:r>
+        <w:t>tell</w:t>
+      </w:r>
+      <w:r>
+        <w:t>s</w:t>
+      </w:r>
+      <w:r>
+        <w:t xml:space="preserve"> us </w:t>
+      </w:r>
+      <w:r>
+        <w:t>user stories are small piece but a step in the right direction for building a formal requirement engineering process</w:t>
+      </w:r>
+      <w:r>
+        <w:t xml:space="preserve"> for the development team</w:t>
+      </w:r>
+      <w:r>
+        <w:t xml:space="preserve">, As the project is large and to be redeveloped user stories would be a helpful practice for the development team to make sense of the requirements </w:t>
+      </w:r>
+      <w:r>
+        <w:t xml:space="preserve">and </w:t>
+      </w:r>
+      <w:r>
+        <w:t>to reduce the complexity of such a large project</w:t>
+      </w:r>
+      <w:r>
+        <w:t xml:space="preserve">. </w:t>
+      </w:r>
+    </w:p>
+    <w:p>
+      <w:pPr>
+        <w:pStyle w:val="Heading2"/>
+      </w:pPr>
+      <w:r>
+        <w:t xml:space="preserve">Project </w:t>
+      </w:r>
+      <w:r>
+        <w:t>Planning and Tracking</w:t>
+      </w:r>
+    </w:p>
+    <w:p>
+      <w:r>
+        <w:t>Product backlogs are a part of the scrum planning process, they allow teams to prioritize features of a given software and track progress based on estimated work (hours) left according to each user story (feature) through a gaant chart.</w:t>
+      </w:r>
+    </w:p>
+    <w:p>
+      <w:r>
+        <w:t xml:space="preserve">From my research I was unable to find any empirical papers to support the benefits of specific </w:t>
+      </w:r>
+      <w:r>
+        <w:t xml:space="preserve">individual </w:t>
+      </w:r>
+      <w:r>
+        <w:t>practices</w:t>
+      </w:r>
+      <w:r>
+        <w:t>. Though</w:t>
+      </w:r>
+      <w:r>
+        <w:t xml:space="preserve"> what I </w:t>
+      </w:r>
+      <w:r>
+        <w:t>did fi</w:t>
+      </w:r>
+      <w:r>
+        <w:t xml:space="preserve">nd was </w:t>
+      </w:r>
+      <w:r>
+        <w:t xml:space="preserve">for the most part </w:t>
+      </w:r>
+      <w:r>
+        <w:t>scrum</w:t>
+      </w:r>
+      <w:r>
+        <w:t xml:space="preserve"> does show some benefits over more traditional methodologies </w:t>
+      </w:r>
+      <w:r>
+        <w:t xml:space="preserve">as in her study </w:t>
+      </w:r>
+      <w:proofErr w:type="spellStart"/>
+      <w:r>
+        <w:t>Lagerberg</w:t>
+      </w:r>
+      <w:proofErr w:type="spellEnd"/>
+      <w:r>
+        <w:t xml:space="preserve"> found Project B (scrum project group) rated higher or equally in all</w:t>
+      </w:r>
+      <w:r>
+        <w:t xml:space="preserve"> areas</w:t>
+      </w:r>
+      <w:r>
+        <w:t xml:space="preserve"> except</w:t>
+      </w:r>
+      <w:r>
+        <w:t xml:space="preserve"> productivity</w:t>
+      </w:r>
+      <w:r>
+        <w:t xml:space="preserve"> </w:t>
+      </w:r>
+      <w:r>
+        <w:t>[</w:t>
+      </w:r>
+      <w:r>
+        <w:t>1</w:t>
+      </w:r>
+      <w:r>
+        <w:t>].</w:t>
+      </w:r>
+      <w:r>
+        <w:t xml:space="preserve"> </w:t>
+      </w:r>
+      <w:proofErr w:type="spellStart"/>
+      <w:r>
+        <w:t>Lagerberg</w:t>
+      </w:r>
+      <w:proofErr w:type="spellEnd"/>
+      <w:r>
+        <w:t xml:space="preserve"> did touch on this in her paper hinting that these perceived benefits could have been a result of planning</w:t>
+      </w:r>
+      <w:r>
+        <w:t xml:space="preserve"> </w:t>
+      </w:r>
+      <w:r>
+        <w:t>amongst</w:t>
+      </w:r>
+      <w:r>
+        <w:t xml:space="preserve"> other things</w:t>
+      </w:r>
+      <w:r>
+        <w:t xml:space="preserve"> and may be lost if less time were to be spent on this, with more research needing to be done in this area [1]. I do agree with her on both points as scrum is a methodology with a strong focus on</w:t>
+      </w:r>
+      <w:r>
+        <w:t xml:space="preserve"> planning and re-planning especially at the beginning of sprints. </w:t>
+      </w:r>
+    </w:p>
+    <w:p>
+      <w:r>
+        <w:t>Of course there were many limitation in this study in that they only looked at one set of project groups within a corporation</w:t>
+      </w:r>
+      <w:r>
+        <w:t xml:space="preserve"> or participant error amongst other things</w:t>
+      </w:r>
+      <w:r>
+        <w:t xml:space="preserve"> however there is other research that shows the benefits of agile practices</w:t>
+      </w:r>
+      <w:r>
+        <w:t xml:space="preserve">. </w:t>
+      </w:r>
+      <w:proofErr w:type="spellStart"/>
+      <w:r>
+        <w:t>Serrador</w:t>
+      </w:r>
+      <w:proofErr w:type="spellEnd"/>
+      <w:r>
+        <w:t xml:space="preserve"> &amp; Pinto </w:t>
+      </w:r>
+      <w:r>
+        <w:t>found in their research that</w:t>
+      </w:r>
+      <w:r>
+        <w:t xml:space="preserve"> there is some correlation between the amount of time spent planning and the success of a project </w:t>
+      </w:r>
+      <w:r>
+        <w:t>[2]</w:t>
+      </w:r>
+      <w:r>
+        <w:t xml:space="preserve">, even if the research </w:t>
+      </w:r>
+      <w:r>
+        <w:t xml:space="preserve">looked at agile methodologies under a single umbrella, they </w:t>
+      </w:r>
+      <w:r>
+        <w:t>more or less follow the same basic principles of agile and</w:t>
+      </w:r>
+      <w:r>
+        <w:t xml:space="preserve"> </w:t>
+      </w:r>
+      <w:r>
+        <w:t>thus</w:t>
+      </w:r>
+      <w:r>
+        <w:t xml:space="preserve"> the </w:t>
+      </w:r>
+      <w:r>
+        <w:t>results</w:t>
+      </w:r>
+      <w:r>
+        <w:t xml:space="preserve"> </w:t>
+      </w:r>
+      <w:r>
+        <w:t>can be applied to scrum practices as well</w:t>
+      </w:r>
+      <w:r>
+        <w:t xml:space="preserve">. </w:t>
+      </w:r>
+    </w:p>
+    <w:p>
+      <w:r>
+        <w:t xml:space="preserve">It is plain to see the practices of agile will benefit this project regardless of what they were, but the practice of creating a product backlog was chosen because the documentation provides an overview of the project requirements and scope to team members along with the ability to track progress as a by-product of the accompanying gaant chart common this practice. Due to the immense size of the software this practice will allow the </w:t>
+      </w:r>
+      <w:r>
+        <w:t>development</w:t>
+      </w:r>
+      <w:r>
+        <w:t xml:space="preserve"> team to prioritize and </w:t>
+      </w:r>
+      <w:r>
+        <w:t>manage requirement complexity as well as to keep the project complexity low to allow future team members to understand what is required from the project quickly as possible.</w:t>
+      </w:r>
+    </w:p>
+    <w:p>
+      <w:pPr>
+        <w:pStyle w:val="Heading2"/>
+      </w:pPr>
+      <w:r>
+        <w:t>Managing Change</w:t>
+      </w:r>
+    </w:p>
+    <w:p/>
+    <w:p>
+      <w:pPr>
+        <w:pStyle w:val="Heading2"/>
+      </w:pPr>
+      <w:r>
+        <w:t>Quality Assurance</w:t>
+      </w:r>
+    </w:p>
+    <w:p>
+      <w:pPr>
+        <w:pStyle w:val="Heading1"/>
+      </w:pPr>
+      <w:r>
+        <w:t>Conclusion</w:t>
+      </w:r>
+    </w:p>
+    <w:p>
+      <w:r>
+        <w:t>To conclude overall a scrum approach would benefit this development team if they are not already utilizing this methodology</w:t>
       </w:r>
       <w:r>
         <w:t>.</w:t>
       </w:r>
       <w:r>
-        <w:t xml:space="preserve"> User stories would allow the development team to easily document requirements </w:t>
-      </w:r>
-      <w:r>
-        <w:t xml:space="preserve">and feeds directly into the scrum practice of product </w:t>
-      </w:r>
-      <w:r>
-        <w:t>backlogs. This</w:t>
-      </w:r>
-      <w:r>
-        <w:t xml:space="preserve"> research </w:t>
-      </w:r>
-      <w:r>
-        <w:t xml:space="preserve">tells us </w:t>
-      </w:r>
-      <w:r>
-        <w:t>user stories are small piece but a step in the right direction for building a formal requirement engineering process</w:t>
-      </w:r>
-      <w:r>
-        <w:t xml:space="preserve"> for the development team</w:t>
-      </w:r>
-      <w:r>
-        <w:t xml:space="preserve">. </w:t>
-      </w:r>
-    </w:p>
-    <w:p>
-      <w:pPr>
-        <w:pStyle w:val="Heading2"/>
-      </w:pPr>
-      <w:r>
-        <w:t xml:space="preserve">Project </w:t>
-      </w:r>
-      <w:r>
-        <w:t>Planning and Tracking</w:t>
-      </w:r>
-    </w:p>
-    <w:p>
-      <w:r>
-        <w:t>Product backlogs are a part of the scrum planning process, they allow teams to prioritize features of a given software and track progress based on estimated work (hours) left according to each user story (feature) through a gaant chart.</w:t>
-      </w:r>
-    </w:p>
-    <w:p>
-      <w:r>
-        <w:t xml:space="preserve">From my research I was unable to find any empirical papers to support the benefits of specific </w:t>
-      </w:r>
-      <w:r>
-        <w:t xml:space="preserve">individual </w:t>
-      </w:r>
-      <w:r>
-        <w:t>practices</w:t>
-      </w:r>
-      <w:r>
-        <w:t>. Though</w:t>
-      </w:r>
-      <w:r>
-        <w:t xml:space="preserve"> what I </w:t>
-      </w:r>
-      <w:r>
-        <w:t>did fi</w:t>
-      </w:r>
-      <w:r>
-        <w:t xml:space="preserve">nd was </w:t>
-      </w:r>
-      <w:r>
-        <w:t xml:space="preserve">for the most part </w:t>
-      </w:r>
-      <w:r>
-        <w:t>scrum</w:t>
-      </w:r>
-      <w:r>
-        <w:t xml:space="preserve"> does show some benefits over more traditional methodologies </w:t>
-      </w:r>
-      <w:r>
-        <w:t xml:space="preserve">as in her study </w:t>
-      </w:r>
-      <w:proofErr w:type="spellStart"/>
-      <w:r>
-        <w:t>Lagerberg</w:t>
-      </w:r>
-      <w:proofErr w:type="spellEnd"/>
-      <w:r>
-        <w:t xml:space="preserve"> found Project B (scrum project group) rated higher or equally in all</w:t>
-      </w:r>
-      <w:r>
-        <w:t xml:space="preserve"> areas</w:t>
-      </w:r>
-      <w:r>
-        <w:t xml:space="preserve"> except</w:t>
-      </w:r>
-      <w:r>
-        <w:t xml:space="preserve"> productivity</w:t>
-      </w:r>
-      <w:r>
         <w:t xml:space="preserve"> </w:t>
       </w:r>
       <w:r>
-        <w:t>[</w:t>
-      </w:r>
-      <w:r>
-        <w:t>1</w:t>
-      </w:r>
-      <w:r>
-        <w:t>].</w:t>
+        <w:t>T</w:t>
+      </w:r>
+      <w:r>
+        <w:t>here is plenty of research providing empirical evidence of the benefits of agile over traditional methodologies.</w:t>
       </w:r>
       <w:r>
         <w:t xml:space="preserve"> </w:t>
       </w:r>
-      <w:proofErr w:type="spellStart"/>
-      <w:r>
-        <w:t>Lagerberg</w:t>
-      </w:r>
-      <w:proofErr w:type="spellEnd"/>
-      <w:r>
-        <w:t xml:space="preserve"> did touch on this in her paper hinting that these perceived benefits could have been a result of planning</w:t>
-      </w:r>
-      <w:r>
-        <w:t xml:space="preserve"> </w:t>
-      </w:r>
-      <w:r>
-        <w:t>amongst</w:t>
-      </w:r>
-      <w:r>
-        <w:t xml:space="preserve"> other things</w:t>
-      </w:r>
-      <w:r>
-        <w:t xml:space="preserve"> and may be lost if less time were to be spent on this, with more research needing to be done in this area [1]. I do agree with her on both points as scrum is a methodology with a strong focus on</w:t>
-      </w:r>
-      <w:r>
-        <w:t xml:space="preserve"> planning and re-planning especially at the beginning of sprints. </w:t>
-      </w:r>
-    </w:p>
-    <w:p>
-      <w:r>
-        <w:t>Of course there were many limitation in this study in that they only looked at one set of project groups within a corporation</w:t>
-      </w:r>
-      <w:r>
-        <w:t xml:space="preserve"> or participant error amongst other things</w:t>
-      </w:r>
-      <w:r>
-        <w:t xml:space="preserve"> however there is other research that shows the benefits of agile practices</w:t>
-      </w:r>
-      <w:r>
-        <w:t xml:space="preserve">. </w:t>
-      </w:r>
-      <w:proofErr w:type="spellStart"/>
-      <w:r>
-        <w:t>Serrador</w:t>
-      </w:r>
-      <w:proofErr w:type="spellEnd"/>
-      <w:r>
-        <w:t xml:space="preserve"> &amp; Pinto </w:t>
-      </w:r>
-      <w:r>
-        <w:t>found in their research that</w:t>
-      </w:r>
-      <w:r>
-        <w:t xml:space="preserve"> there is some correlation between the amount of time spent planning and the success of a project </w:t>
-      </w:r>
-      <w:r>
-        <w:t>[2]</w:t>
-      </w:r>
-      <w:r>
-        <w:t xml:space="preserve">, even if the research </w:t>
-      </w:r>
-      <w:r>
-        <w:t xml:space="preserve">looked at agile methodologies under a single umbrella, they </w:t>
-      </w:r>
-      <w:r>
-        <w:t>more or less follow the same basic principles of agile and</w:t>
-      </w:r>
-      <w:r>
-        <w:t xml:space="preserve"> </w:t>
-      </w:r>
-      <w:r>
-        <w:t>thus</w:t>
-      </w:r>
-      <w:r>
-        <w:t xml:space="preserve"> the </w:t>
-      </w:r>
-      <w:r>
-        <w:t>results</w:t>
-      </w:r>
-      <w:r>
-        <w:t xml:space="preserve"> </w:t>
-      </w:r>
-      <w:r>
-        <w:t>can be applied to scrum practices as well</w:t>
-      </w:r>
-      <w:r>
-        <w:t xml:space="preserve">. </w:t>
-      </w:r>
-    </w:p>
-    <w:p>
-      <w:r>
-        <w:t xml:space="preserve">It is plain to see the practices of agile will benefit this project regardless of what they were, but the practice of creating a product backlog was chosen because the documentation provides an overview of the project requirements and scope to team members along with the ability to track progress as a by-product of the accompanying gaant chart common this practice. Due to the immense size of the software this practice will allow the </w:t>
-      </w:r>
-      <w:r>
-        <w:t>development</w:t>
-      </w:r>
-      <w:r>
-        <w:t xml:space="preserve"> team to prioritize and </w:t>
-      </w:r>
-      <w:r>
-        <w:t>manage requirement complexity as well as to keep the project complexity low to allow future team members to understand what is required from the project quickly as possible.</w:t>
-      </w:r>
-    </w:p>
-    <w:p>
-      <w:pPr>
-        <w:pStyle w:val="Heading2"/>
-      </w:pPr>
-      <w:r>
-        <w:t>Managing Change</w:t>
-      </w:r>
-    </w:p>
-    <w:p/>
-    <w:p>
-      <w:pPr>
-        <w:pStyle w:val="Heading2"/>
-      </w:pPr>
-      <w:r>
-        <w:t>Quality Assurance</w:t>
-      </w:r>
-    </w:p>
-    <w:p>
-      <w:pPr>
-        <w:pStyle w:val="Heading1"/>
-      </w:pPr>
-      <w:r>
-        <w:t>Conclusion</w:t>
-      </w:r>
-    </w:p>
-    <w:p>
-      <w:r>
-        <w:t>To conclude overall a scrum approach would benefit this development team if they are not already utilizing this methodology</w:t>
-      </w:r>
-      <w:r>
-        <w:t>.</w:t>
-      </w:r>
-      <w:r>
-        <w:t xml:space="preserve"> </w:t>
-      </w:r>
-      <w:r>
-        <w:t>T</w:t>
-      </w:r>
-      <w:r>
-        <w:t>here is plenty of research providing empirical evidence of the benefits of agile over traditional methodologies.</w:t>
-      </w:r>
-      <w:r>
-        <w:t xml:space="preserve"> </w:t>
-      </w:r>
+    </w:p>
+    <w:p>
       <w:bookmarkStart w:id="0" w:name="_GoBack"/>
       <w:bookmarkEnd w:id="0"/>
       <w:r>
+        <w:lastRenderedPageBreak/>
         <w:t>However this does not mean the development team should reject and should not adapt what already works for them into an agile methodology.</w:t>
       </w:r>
     </w:p>
@@ -550,7 +564,6 @@
         <w:pStyle w:val="Heading1"/>
       </w:pPr>
       <w:r>
-        <w:lastRenderedPageBreak/>
         <w:t>References</w:t>
       </w:r>
     </w:p>

</xml_diff>